<commit_message>
I replaced the example workflow with the full project version
</commit_message>
<xml_diff>
--- a/docs/LIVE_RUN_GUIDE.docx
+++ b/docs/LIVE_RUN_GUIDE.docx
@@ -120,7 +120,7 @@
         <w:t xml:space="preserve">Look for: </w:t>
       </w:r>
       <w:r>
-        <w:t>Benchmark passed; 117 matched IDs; 0 missing; 0 duplicates; 117 earthquakes; 311 locations; 36,387 pairs; 145,548 ground-motion rows; 36,387 provisional damage rows.</w:t>
+        <w:t>Benchmark passed; 117 matched IDs; 0 missing; 0 duplicates; 117 earthquakes; 311 locations; 36,387 pairs; 145,548 ground-motion rows; 36,387 mean structural-loss-ratio rows.</w:t>
       </w:r>
     </w:p>
     <w:p>
@@ -181,7 +181,7 @@
         <w:pStyle w:val="Heading1"/>
       </w:pPr>
       <w:r>
-        <w:t>6. Open the damage-ratio results</w:t>
+        <w:t>6. Open the structural-loss-ratio results</w:t>
       </w:r>
     </w:p>
     <w:p>
@@ -193,7 +193,7 @@
           <w:rFonts w:ascii="Consolas" w:hAnsi="Consolas"/>
           <w:sz w:val="16"/>
         </w:rPr>
-        <w:t>start outputs_gwfm\provisional_damage_ratios.csv</w:t>
+        <w:t>start outputs_gwfm\structural_loss_ratios.csv</w:t>
       </w:r>
     </w:p>
     <w:p>
@@ -204,7 +204,7 @@
         <w:t xml:space="preserve">Say: </w:t>
       </w:r>
       <w:r>
-        <w:t>These are the PGA values passed through the current vulnerability curve. 0 means no damage and 1 means complete destruction. The results are provisional until the final curve is agreed.</w:t>
+        <w:t>These are mean structural loss ratios conditional on median PGA, calculated with the exact GEM v2026 structural function CR/LFINF/CDL+ERL/H:2/RES. Contents, nonstructural and fatalities models are excluded. The file is not a complete portfolio or insured-loss estimate.</w:t>
       </w:r>
     </w:p>
     <w:p>
@@ -302,7 +302,7 @@
         <w:t xml:space="preserve">One-line finish: </w:t>
       </w:r>
       <w:r>
-        <w:t>“The workflow runs 117 earthquakes across 311 locations, producing 145,548 ground-motion results and 36,387 provisional damage ratios, with the remaining scientific decisions clearly flagged.”</w:t>
+        <w:t>“The workflow runs 117 earthquakes across 311 locations, producing 145,548 ground-motion results and 36,387 mean structural-loss ratios, with the remaining scientific limitations clearly flagged.”</w:t>
       </w:r>
     </w:p>
     <w:sectPr>

</xml_diff>

<commit_message>
I added waveform, ISC-EHB and Global CMT depths
</commit_message>
<xml_diff>
--- a/docs/LIVE_RUN_GUIDE.docx
+++ b/docs/LIVE_RUN_GUIDE.docx
@@ -16,11 +16,9 @@
         <w:rPr>
           <w:b/>
         </w:rPr>
-        <w:t xml:space="preserve">Goal: </w:t>
+        <w:t>Goal: Run the full 117-event, multi-depth programme, show the checks, then open the CSV and map outputs.</w:t>
       </w:r>
-      <w:r>
-        <w:t>Run the full 117-event programme, show the checks, then open the CSV and map outputs.</w:t>
-      </w:r>
+      <w:r/>
     </w:p>
     <w:p>
       <w:pPr>
@@ -98,11 +96,9 @@
         <w:rPr>
           <w:b/>
         </w:rPr>
-        <w:t xml:space="preserve">Say: </w:t>
+        <w:t>Say: This loads 117 gWFM earthquakes, creates waveform, ISC-EHB and Global CMT depth scenarios, and calculates each valid depth at 311 exposure locations.</w:t>
       </w:r>
-      <w:r>
-        <w:t>This loads 117 gWFM earthquakes and 311 exposure locations, creates every earthquake-location pair, then calculates PGA, PGV and SA.</w:t>
-      </w:r>
+      <w:r/>
     </w:p>
     <w:p>
       <w:pPr>
@@ -117,22 +113,18 @@
         <w:rPr>
           <w:b/>
         </w:rPr>
-        <w:t xml:space="preserve">Look for: </w:t>
+        <w:t>Look for: Benchmark passed; 117 matched IDs; 0 missing IDs; 0 duplicate IDs; 321 valid event-depth scenarios; 311 locations; 99,831 pairs; 399,324 ground-motion rows; and 99,831 mean structural-loss-ratio rows.</w:t>
       </w:r>
-      <w:r>
-        <w:t>Benchmark passed; 117 matched IDs; 0 missing; 0 duplicates; 117 earthquakes; 311 locations; 36,387 pairs; 145,548 ground-motion rows; 36,387 mean structural-loss-ratio rows.</w:t>
-      </w:r>
+      <w:r/>
     </w:p>
     <w:p>
       <w:r>
         <w:rPr>
           <w:b/>
         </w:rPr>
-        <w:t xml:space="preserve">Also show: </w:t>
+        <w:t>Also show: 117 valid waveform depths, 110 valid ISC-EHB depths, 94 valid Global CMT depths, 244 depths at or below 30 km, 77 deeper than 30 km, 5,656 pairs within 200 km and 94,175 beyond.</w:t>
       </w:r>
-      <w:r>
-        <w:t>92 events at or below 30 km, 25 deeper than 30 km, 2,182 pairs within 200 km and 34,205 beyond 200 km.</w:t>
-      </w:r>
+      <w:r/>
     </w:p>
     <w:p>
       <w:r>
@@ -150,7 +142,7 @@
         <w:pStyle w:val="Heading1"/>
       </w:pPr>
       <w:r>
-        <w:t>5. Open the ground-motion results</w:t>
+        <w:t>5. Open the depth table and ground-motion results</w:t>
       </w:r>
     </w:p>
     <w:p>
@@ -162,6 +154,8 @@
           <w:rFonts w:ascii="Consolas" w:hAnsi="Consolas"/>
           <w:sz w:val="16"/>
         </w:rPr>
+        <w:t>start outputs_gwfm\selected_event_depths.csv</w:t>
+        <w:br/>
         <w:t>start outputs_gwfm\ground_motion_results.csv</w:t>
       </w:r>
     </w:p>
@@ -170,11 +164,9 @@
         <w:rPr>
           <w:b/>
         </w:rPr>
-        <w:t xml:space="preserve">Say: </w:t>
+        <w:t>Say: The depth table records valid, missing, sentinel and non-positive depths by catalogue. Each ground-motion row is one intensity measure for one event-depth-location scenario and includes the depth source, PGA/PGV/SA value and distance flags.</w:t>
       </w:r>
-      <w:r>
-        <w:t>Each row is one intensity measure for one earthquake-location pair. The file contains PGA, PGV, SA(0.2 s), SA(1 s), source depth, distances and the two flags.</w:t>
-      </w:r>
+      <w:r/>
     </w:p>
     <w:p>
       <w:pPr>
@@ -244,11 +236,9 @@
         <w:rPr>
           <w:b/>
         </w:rPr>
-        <w:t xml:space="preserve">Say: </w:t>
+        <w:t>Say: The first map checks the exposure grid and selected earthquakes. The second shows waveform-depth median PGA across the 311 locations for one selected event.</w:t>
       </w:r>
-      <w:r>
-        <w:t>The first checks the exposure grid and selected earthquakes. The second shows median PGA across the 311 locations for one selected event.</w:t>
-      </w:r>
+      <w:r/>
     </w:p>
     <w:p>
       <w:pPr>
@@ -299,11 +289,9 @@
         <w:rPr>
           <w:b/>
         </w:rPr>
-        <w:t xml:space="preserve">One-line finish: </w:t>
+        <w:t>One-line finish: The workflow runs 321 valid depth scenarios from 117 earthquakes across 311 locations, producing 399,324 ground-motion results and 99,831 mean structural-loss ratios, with missing depths and scientific limitations clearly flagged.</w:t>
       </w:r>
-      <w:r>
-        <w:t>“The workflow runs 117 earthquakes across 311 locations, producing 145,548 ground-motion results and 36,387 mean structural-loss ratios, with the remaining scientific limitations clearly flagged.”</w:t>
-      </w:r>
+      <w:r/>
     </w:p>
     <w:sectPr>
       <w:footerReference w:type="default" r:id="rId8"/>

</xml_diff>

<commit_message>
I added waveform, ISC-EHB and Global CMT depth alternatives
To investigate how earthquake depth uncertainty affected the model, I extended the workflow beyond a single depth value. I added waveform-modelled, ISC-EHB and Global CMT depths, selected-depth outputs and depth-scenario tests.
</commit_message>
<xml_diff>
--- a/docs/LIVE_RUN_GUIDE.docx
+++ b/docs/LIVE_RUN_GUIDE.docx
@@ -16,11 +16,9 @@
         <w:rPr>
           <w:b/>
         </w:rPr>
-        <w:t xml:space="preserve">Goal: </w:t>
+        <w:t>Goal: Run the full 117-event, multi-depth programme, show the checks, then open the CSV and map outputs.</w:t>
       </w:r>
-      <w:r>
-        <w:t>Run the full 117-event programme, show the checks, then open the CSV and map outputs.</w:t>
-      </w:r>
+      <w:r/>
     </w:p>
     <w:p>
       <w:pPr>
@@ -98,11 +96,9 @@
         <w:rPr>
           <w:b/>
         </w:rPr>
-        <w:t xml:space="preserve">Say: </w:t>
+        <w:t>Say: This loads 117 gWFM earthquakes, creates waveform, ISC-EHB and Global CMT depth scenarios, and calculates each valid depth at 311 exposure locations.</w:t>
       </w:r>
-      <w:r>
-        <w:t>This loads 117 gWFM earthquakes and 311 exposure locations, creates every earthquake-location pair, then calculates PGA, PGV and SA.</w:t>
-      </w:r>
+      <w:r/>
     </w:p>
     <w:p>
       <w:pPr>
@@ -117,22 +113,18 @@
         <w:rPr>
           <w:b/>
         </w:rPr>
-        <w:t xml:space="preserve">Look for: </w:t>
+        <w:t>Look for: Benchmark passed; 117 matched IDs; 0 missing IDs; 0 duplicate IDs; 321 valid event-depth scenarios; 311 locations; 99,831 pairs; 399,324 ground-motion rows; and 99,831 mean structural-loss-ratio rows.</w:t>
       </w:r>
-      <w:r>
-        <w:t>Benchmark passed; 117 matched IDs; 0 missing; 0 duplicates; 117 earthquakes; 311 locations; 36,387 pairs; 145,548 ground-motion rows; 36,387 mean structural-loss-ratio rows.</w:t>
-      </w:r>
+      <w:r/>
     </w:p>
     <w:p>
       <w:r>
         <w:rPr>
           <w:b/>
         </w:rPr>
-        <w:t xml:space="preserve">Also show: </w:t>
+        <w:t>Also show: 117 valid waveform depths, 110 valid ISC-EHB depths, 94 valid Global CMT depths, 244 depths at or below 30 km, 77 deeper than 30 km, 5,656 pairs within 200 km and 94,175 beyond.</w:t>
       </w:r>
-      <w:r>
-        <w:t>92 events at or below 30 km, 25 deeper than 30 km, 2,182 pairs within 200 km and 34,205 beyond 200 km.</w:t>
-      </w:r>
+      <w:r/>
     </w:p>
     <w:p>
       <w:r>
@@ -150,7 +142,7 @@
         <w:pStyle w:val="Heading1"/>
       </w:pPr>
       <w:r>
-        <w:t>5. Open the ground-motion results</w:t>
+        <w:t>5. Open the depth table and ground-motion results</w:t>
       </w:r>
     </w:p>
     <w:p>
@@ -162,6 +154,8 @@
           <w:rFonts w:ascii="Consolas" w:hAnsi="Consolas"/>
           <w:sz w:val="16"/>
         </w:rPr>
+        <w:t>start outputs_gwfm\selected_event_depths.csv</w:t>
+        <w:br/>
         <w:t>start outputs_gwfm\ground_motion_results.csv</w:t>
       </w:r>
     </w:p>
@@ -170,11 +164,9 @@
         <w:rPr>
           <w:b/>
         </w:rPr>
-        <w:t xml:space="preserve">Say: </w:t>
+        <w:t>Say: The depth table records valid, missing, sentinel and non-positive depths by catalogue. Each ground-motion row is one intensity measure for one event-depth-location scenario and includes the depth source, PGA/PGV/SA value and distance flags.</w:t>
       </w:r>
-      <w:r>
-        <w:t>Each row is one intensity measure for one earthquake-location pair. The file contains PGA, PGV, SA(0.2 s), SA(1 s), source depth, distances and the two flags.</w:t>
-      </w:r>
+      <w:r/>
     </w:p>
     <w:p>
       <w:pPr>
@@ -244,11 +236,9 @@
         <w:rPr>
           <w:b/>
         </w:rPr>
-        <w:t xml:space="preserve">Say: </w:t>
+        <w:t>Say: The first map checks the exposure grid and selected earthquakes. The second shows waveform-depth median PGA across the 311 locations for one selected event.</w:t>
       </w:r>
-      <w:r>
-        <w:t>The first checks the exposure grid and selected earthquakes. The second shows median PGA across the 311 locations for one selected event.</w:t>
-      </w:r>
+      <w:r/>
     </w:p>
     <w:p>
       <w:pPr>
@@ -299,11 +289,9 @@
         <w:rPr>
           <w:b/>
         </w:rPr>
-        <w:t xml:space="preserve">One-line finish: </w:t>
+        <w:t>One-line finish: The workflow runs 321 valid depth scenarios from 117 earthquakes across 311 locations, producing 399,324 ground-motion results and 99,831 mean structural-loss ratios, with missing depths and scientific limitations clearly flagged.</w:t>
       </w:r>
-      <w:r>
-        <w:t>“The workflow runs 117 earthquakes across 311 locations, producing 145,548 ground-motion results and 36,387 mean structural-loss ratios, with the remaining scientific limitations clearly flagged.”</w:t>
-      </w:r>
+      <w:r/>
     </w:p>
     <w:sectPr>
       <w:footerReference w:type="default" r:id="rId8"/>

</xml_diff>